<commit_message>
offset was not right
</commit_message>
<xml_diff>
--- a/default-template-cvss-score.docx
+++ b/default-template-cvss-score.docx
@@ -23,14 +23,12 @@
         </w:rPr>
         <w:t>${</w:t>
       </w:r>
-      <w:proofErr w:type="spellStart"/>
       <w:r>
         <w:rPr>
           <w:rFonts w:ascii="Arial" w:hAnsi="Arial" w:cs="Arial"/>
         </w:rPr>
         <w:t>asmtName</w:t>
       </w:r>
-      <w:proofErr w:type="spellEnd"/>
       <w:r>
         <w:rPr>
           <w:rFonts w:ascii="Arial" w:hAnsi="Arial" w:cs="Arial"/>
@@ -232,7 +230,6 @@
               </w:rPr>
               <w:t>${</w:t>
             </w:r>
-            <w:proofErr w:type="spellStart"/>
             <w:r>
               <w:rPr>
                 <w:rFonts w:ascii="Arial" w:hAnsi="Arial" w:cs="Arial"/>
@@ -240,7 +237,6 @@
               </w:rPr>
               <w:t>asmtType</w:t>
             </w:r>
-            <w:proofErr w:type="spellEnd"/>
             <w:r>
               <w:rPr>
                 <w:rFonts w:ascii="Arial" w:hAnsi="Arial" w:cs="Arial"/>
@@ -411,7 +407,6 @@
         </w:rPr>
         <w:t>Assessor: ${</w:t>
       </w:r>
-      <w:proofErr w:type="spellStart"/>
       <w:r>
         <w:rPr>
           <w:rFonts w:ascii="Arial" w:hAnsi="Arial" w:cs="Arial"/>
@@ -419,7 +414,6 @@
         </w:rPr>
         <w:t>asmtAssessor</w:t>
       </w:r>
-      <w:proofErr w:type="spellEnd"/>
       <w:r>
         <w:rPr>
           <w:rFonts w:ascii="Arial" w:hAnsi="Arial" w:cs="Arial"/>
@@ -573,30 +567,20 @@
         <w:rPr>
           <w:rFonts w:ascii="Arial" w:hAnsi="Arial" w:cs="Arial"/>
         </w:rPr>
-        <w:t>{</w:t>
-      </w:r>
-      <w:proofErr w:type="spellStart"/>
-      <w:r>
-        <w:rPr>
-          <w:rFonts w:ascii="Arial" w:hAnsi="Arial" w:cs="Arial"/>
-        </w:rPr>
-        <w:t>asmtTeam</w:t>
-      </w:r>
-      <w:proofErr w:type="spellEnd"/>
+        <w:t>{asmtTeam</w:t>
+      </w:r>
       <w:r>
         <w:rPr>
           <w:rFonts w:ascii="Arial" w:hAnsi="Arial" w:cs="Arial"/>
         </w:rPr>
         <w:t>} was engaged to conduct a web application security assessment of the ${</w:t>
       </w:r>
-      <w:proofErr w:type="spellStart"/>
       <w:r>
         <w:rPr>
           <w:rFonts w:ascii="Arial" w:hAnsi="Arial" w:cs="Arial"/>
         </w:rPr>
         <w:t>asmtName</w:t>
       </w:r>
-      <w:proofErr w:type="spellEnd"/>
       <w:r>
         <w:rPr>
           <w:rFonts w:ascii="Arial" w:hAnsi="Arial" w:cs="Arial"/>
@@ -700,14 +684,12 @@
         </w:rPr>
         <w:t>The main objective of our penetration test is to perform due-diligence testing of the ${</w:t>
       </w:r>
-      <w:proofErr w:type="spellStart"/>
       <w:r>
         <w:rPr>
           <w:rFonts w:ascii="Arial" w:hAnsi="Arial" w:cs="Arial"/>
         </w:rPr>
         <w:t>asmtName</w:t>
       </w:r>
-      <w:proofErr w:type="spellEnd"/>
       <w:r>
         <w:rPr>
           <w:rFonts w:ascii="Arial" w:hAnsi="Arial" w:cs="Arial"/>
@@ -727,7 +709,6 @@
         </w:rPr>
         <w:t>The scope included the ${</w:t>
       </w:r>
-      <w:proofErr w:type="spellStart"/>
       <w:proofErr w:type="gramStart"/>
       <w:r>
         <w:rPr>
@@ -735,7 +716,6 @@
         </w:rPr>
         <w:t>asmtName</w:t>
       </w:r>
-      <w:proofErr w:type="spellEnd"/>
       <w:r>
         <w:rPr>
           <w:rFonts w:ascii="Arial" w:hAnsi="Arial" w:cs="Arial"/>
@@ -755,28 +735,24 @@
         </w:rPr>
         <w:t>sting started ${</w:t>
       </w:r>
-      <w:proofErr w:type="spellStart"/>
       <w:r>
         <w:rPr>
           <w:rFonts w:ascii="Arial" w:hAnsi="Arial" w:cs="Arial"/>
         </w:rPr>
         <w:t>asmtStart</w:t>
       </w:r>
-      <w:proofErr w:type="spellEnd"/>
       <w:r>
         <w:rPr>
           <w:rFonts w:ascii="Arial" w:hAnsi="Arial" w:cs="Arial"/>
         </w:rPr>
         <w:t>} and ended on ${</w:t>
       </w:r>
-      <w:proofErr w:type="spellStart"/>
       <w:r>
         <w:rPr>
           <w:rFonts w:ascii="Arial" w:hAnsi="Arial" w:cs="Arial"/>
         </w:rPr>
         <w:t>asmtEnd</w:t>
       </w:r>
-      <w:proofErr w:type="spellEnd"/>
       <w:r>
         <w:rPr>
           <w:rFonts w:ascii="Arial" w:hAnsi="Arial" w:cs="Arial"/>
@@ -871,7 +847,7 @@
           <w:noProof/>
         </w:rPr>
         <w:drawing>
-          <wp:anchor distT="0" distB="0" distL="114300" distR="114300" simplePos="0" relativeHeight="251658240" behindDoc="0" locked="0" layoutInCell="1" allowOverlap="1" wp14:anchorId="0E93C14F" wp14:editId="40FCBD8B">
+          <wp:anchor distT="0" distB="0" distL="114300" distR="114300" simplePos="0" relativeHeight="251658240" behindDoc="0" locked="0" layoutInCell="1" allowOverlap="1" wp14:anchorId="0E93C14F" wp14:editId="09396FF9">
             <wp:simplePos x="0" y="0"/>
             <wp:positionH relativeFrom="column">
               <wp:posOffset>4172585</wp:posOffset>
@@ -1056,63 +1032,7 @@
         <w:rPr>
           <w:rFonts w:ascii="Arial" w:hAnsi="Arial" w:cs="Arial"/>
         </w:rPr>
-        <w:t xml:space="preserve"> are used when performing application security assessments.  A sampling of tools available includes Burp Suite Professional Edition, IBM </w:t>
-      </w:r>
-      <w:proofErr w:type="spellStart"/>
-      <w:r>
-        <w:rPr>
-          <w:rFonts w:ascii="Arial" w:hAnsi="Arial" w:cs="Arial"/>
-        </w:rPr>
-        <w:t>AppScan</w:t>
-      </w:r>
-      <w:proofErr w:type="spellEnd"/>
-      <w:r>
-        <w:rPr>
-          <w:rFonts w:ascii="Arial" w:hAnsi="Arial" w:cs="Arial"/>
-        </w:rPr>
-        <w:t xml:space="preserve"> Black Box Edition, </w:t>
-      </w:r>
-      <w:proofErr w:type="spellStart"/>
-      <w:r>
-        <w:rPr>
-          <w:rFonts w:ascii="Arial" w:hAnsi="Arial" w:cs="Arial"/>
-        </w:rPr>
-        <w:t>Acunetix</w:t>
-      </w:r>
-      <w:proofErr w:type="spellEnd"/>
-      <w:r>
-        <w:rPr>
-          <w:rFonts w:ascii="Arial" w:hAnsi="Arial" w:cs="Arial"/>
-        </w:rPr>
-        <w:t xml:space="preserve"> Application Security Scanner, Metasploit Pro, </w:t>
-      </w:r>
-      <w:proofErr w:type="spellStart"/>
-      <w:r>
-        <w:rPr>
-          <w:rFonts w:ascii="Arial" w:hAnsi="Arial" w:cs="Arial"/>
-        </w:rPr>
-        <w:t>NeXpose</w:t>
-      </w:r>
-      <w:proofErr w:type="spellEnd"/>
-      <w:r>
-        <w:rPr>
-          <w:rFonts w:ascii="Arial" w:hAnsi="Arial" w:cs="Arial"/>
-        </w:rPr>
-        <w:t xml:space="preserve">, Nessus, and </w:t>
-      </w:r>
-      <w:proofErr w:type="spellStart"/>
-      <w:r>
-        <w:rPr>
-          <w:rFonts w:ascii="Arial" w:hAnsi="Arial" w:cs="Arial"/>
-        </w:rPr>
-        <w:t>Checkmarx</w:t>
-      </w:r>
-      <w:proofErr w:type="spellEnd"/>
-      <w:r>
-        <w:rPr>
-          <w:rFonts w:ascii="Arial" w:hAnsi="Arial" w:cs="Arial"/>
-        </w:rPr>
-        <w:t xml:space="preserve"> source code analyzer.  </w:t>
+        <w:t xml:space="preserve"> are used when performing application security assessments.  A sampling of tools available includes Burp Suite Professional Edition, IBM AppScan Black Box Edition, Acunetix Application Security Scanner, Metasploit Pro, NeXpose, Nessus, and Checkmarx source code analyzer.  </w:t>
       </w:r>
       <w:r>
         <w:rPr>
@@ -1213,14 +1133,7 @@
               <w:rPr>
                 <w:rFonts w:ascii="Arial" w:hAnsi="Arial" w:cs="Arial"/>
               </w:rPr>
-              <w:t>${</w:t>
-            </w:r>
-            <w:proofErr w:type="spellStart"/>
-            <w:r>
-              <w:rPr>
-                <w:rFonts w:ascii="Arial" w:hAnsi="Arial" w:cs="Arial"/>
-              </w:rPr>
-              <w:t>vuln</w:t>
+              <w:t>${vuln</w:t>
             </w:r>
             <w:r>
               <w:rPr>
@@ -1232,14 +1145,7 @@
               <w:rPr>
                 <w:rFonts w:ascii="Arial" w:hAnsi="Arial" w:cs="Arial"/>
               </w:rPr>
-              <w:t>able</w:t>
-            </w:r>
-            <w:proofErr w:type="spellEnd"/>
-            <w:r>
-              <w:rPr>
-                <w:rFonts w:ascii="Arial" w:hAnsi="Arial" w:cs="Arial"/>
-              </w:rPr>
-              <w:t>}</w:t>
+              <w:t>able}</w:t>
             </w:r>
           </w:p>
         </w:tc>
@@ -1404,21 +1310,7 @@
               <w:rPr>
                 <w:rFonts w:ascii="Arial" w:hAnsi="Arial" w:cs="Arial"/>
               </w:rPr>
-              <w:t>${loop} ${</w:t>
-            </w:r>
-            <w:proofErr w:type="spellStart"/>
-            <w:r>
-              <w:rPr>
-                <w:rFonts w:ascii="Arial" w:hAnsi="Arial" w:cs="Arial"/>
-              </w:rPr>
-              <w:t>vulnName</w:t>
-            </w:r>
-            <w:proofErr w:type="spellEnd"/>
-            <w:r>
-              <w:rPr>
-                <w:rFonts w:ascii="Arial" w:hAnsi="Arial" w:cs="Arial"/>
-              </w:rPr>
-              <w:t>}</w:t>
+              <w:t>${loop} ${vulnName}</w:t>
             </w:r>
           </w:p>
         </w:tc>
@@ -1438,23 +1330,7 @@
                 <w:rFonts w:ascii="Arial" w:hAnsi="Arial" w:cs="Arial"/>
                 <w:color w:val="000000" w:themeColor="text1"/>
               </w:rPr>
-              <w:t>${</w:t>
-            </w:r>
-            <w:proofErr w:type="spellStart"/>
-            <w:r>
-              <w:rPr>
-                <w:rFonts w:ascii="Arial" w:hAnsi="Arial" w:cs="Arial"/>
-                <w:color w:val="000000" w:themeColor="text1"/>
-              </w:rPr>
-              <w:t>cvssString</w:t>
-            </w:r>
-            <w:proofErr w:type="spellEnd"/>
-            <w:r>
-              <w:rPr>
-                <w:rFonts w:ascii="Arial" w:hAnsi="Arial" w:cs="Arial"/>
-                <w:color w:val="000000" w:themeColor="text1"/>
-              </w:rPr>
-              <w:t>}</w:t>
+              <w:t>${cvssString}</w:t>
             </w:r>
           </w:p>
         </w:tc>
@@ -1476,23 +1352,7 @@
                 <w:rFonts w:ascii="Arial" w:hAnsi="Arial" w:cs="Arial"/>
                 <w:color w:val="FFFFFF" w:themeColor="background1"/>
               </w:rPr>
-              <w:t>${</w:t>
-            </w:r>
-            <w:proofErr w:type="spellStart"/>
-            <w:r>
-              <w:rPr>
-                <w:rFonts w:ascii="Arial" w:hAnsi="Arial" w:cs="Arial"/>
-                <w:color w:val="FFFFFF" w:themeColor="background1"/>
-              </w:rPr>
-              <w:t>cvssScore</w:t>
-            </w:r>
-            <w:proofErr w:type="spellEnd"/>
-            <w:r>
-              <w:rPr>
-                <w:rFonts w:ascii="Arial" w:hAnsi="Arial" w:cs="Arial"/>
-                <w:color w:val="FFFFFF" w:themeColor="background1"/>
-              </w:rPr>
-              <w:t>}</w:t>
+              <w:t>${cvssScore}</w:t>
             </w:r>
           </w:p>
         </w:tc>
@@ -1557,8 +1417,8 @@
         <w:tblLook w:val="04A0" w:firstRow="1" w:lastRow="0" w:firstColumn="1" w:lastColumn="0" w:noHBand="0" w:noVBand="1"/>
       </w:tblPr>
       <w:tblGrid>
-        <w:gridCol w:w="360"/>
-        <w:gridCol w:w="1997"/>
+        <w:gridCol w:w="270"/>
+        <w:gridCol w:w="2087"/>
         <w:gridCol w:w="4668"/>
         <w:gridCol w:w="2571"/>
       </w:tblGrid>
@@ -1581,21 +1441,7 @@
               <w:rPr>
                 <w:rFonts w:ascii="Arial" w:hAnsi="Arial" w:cs="Arial"/>
               </w:rPr>
-              <w:t>${</w:t>
-            </w:r>
-            <w:proofErr w:type="spellStart"/>
-            <w:r>
-              <w:rPr>
-                <w:rFonts w:ascii="Arial" w:hAnsi="Arial" w:cs="Arial"/>
-              </w:rPr>
-              <w:t>vulnTable</w:t>
-            </w:r>
-            <w:proofErr w:type="spellEnd"/>
-            <w:r>
-              <w:rPr>
-                <w:rFonts w:ascii="Arial" w:hAnsi="Arial" w:cs="Arial"/>
-              </w:rPr>
-              <w:t>}</w:t>
+              <w:t>${vulnTable}</w:t>
             </w:r>
           </w:p>
         </w:tc>
@@ -1625,7 +1471,7 @@
         </w:trPr>
         <w:tc>
           <w:tcPr>
-            <w:tcW w:w="360" w:type="dxa"/>
+            <w:tcW w:w="270" w:type="dxa"/>
             <w:shd w:val="clear" w:color="auto" w:fill="FAC701"/>
             <w:vAlign w:val="center"/>
           </w:tcPr>
@@ -1655,7 +1501,7 @@
                 <w:sz w:val="10"/>
                 <w:szCs w:val="10"/>
               </w:rPr>
-              <w:t>6</w:t>
+              <w:t>5</w:t>
             </w:r>
             <w:r>
               <w:rPr>
@@ -1670,7 +1516,7 @@
         </w:tc>
         <w:tc>
           <w:tcPr>
-            <w:tcW w:w="6665" w:type="dxa"/>
+            <w:tcW w:w="6755" w:type="dxa"/>
             <w:gridSpan w:val="2"/>
             <w:shd w:val="clear" w:color="auto" w:fill="FAC701"/>
             <w:vAlign w:val="center"/>
@@ -1685,15 +1531,7 @@
               <w:ind w:left="158" w:hanging="180"/>
             </w:pPr>
             <w:r>
-              <w:t>${</w:t>
-            </w:r>
-            <w:proofErr w:type="spellStart"/>
-            <w:r>
-              <w:t>vulnName</w:t>
-            </w:r>
-            <w:proofErr w:type="spellEnd"/>
-            <w:r>
-              <w:t>}</w:t>
+              <w:t>${vulnName}</w:t>
             </w:r>
           </w:p>
         </w:tc>
@@ -1718,7 +1556,6 @@
               </w:rPr>
               <w:t>${</w:t>
             </w:r>
-            <w:proofErr w:type="spellStart"/>
             <w:r>
               <w:rPr>
                 <w:rFonts w:ascii="Arial" w:hAnsi="Arial" w:cs="Arial"/>
@@ -1726,7 +1563,6 @@
               </w:rPr>
               <w:t>cvssScore</w:t>
             </w:r>
-            <w:proofErr w:type="spellEnd"/>
             <w:r>
               <w:rPr>
                 <w:rFonts w:ascii="Arial" w:hAnsi="Arial" w:cs="Arial"/>
@@ -1777,21 +1613,7 @@
               <w:rPr>
                 <w:rFonts w:ascii="Arial" w:hAnsi="Arial" w:cs="Arial"/>
               </w:rPr>
-              <w:t>${</w:t>
-            </w:r>
-            <w:proofErr w:type="spellStart"/>
-            <w:r>
-              <w:rPr>
-                <w:rFonts w:ascii="Arial" w:hAnsi="Arial" w:cs="Arial"/>
-              </w:rPr>
-              <w:t>cvssString</w:t>
-            </w:r>
-            <w:proofErr w:type="spellEnd"/>
-            <w:r>
-              <w:rPr>
-                <w:rFonts w:ascii="Arial" w:hAnsi="Arial" w:cs="Arial"/>
-              </w:rPr>
-              <w:t>}</w:t>
+              <w:t>${cvssString}</w:t>
             </w:r>
           </w:p>
         </w:tc>

</xml_diff>